<commit_message>
Update Admin/logbook.docx and add temp file
Modify binary Admin/logbook.docx and add a new file Admin/~$ogbook.docx (an Office temporary/lock file). The change updates the logbook document and inadvertently includes an editor temp file; consider adding such temp files to .gitignore to avoid committing them in future.
</commit_message>
<xml_diff>
--- a/Admin/logbook.docx
+++ b/Admin/logbook.docx
@@ -1263,11 +1263,6 @@
           <w:rFonts w:ascii="Calibri" w:hAnsi="Calibri" w:cs="Calibri"/>
         </w:rPr>
         <w:t xml:space="preserve">Use the 50 largest tech companies by market cap as the stock picking heuristic. A more sophisticated stock selection model may be developed in a future iteration. Continue writing the midway report: </w:t>
-      </w:r>
-      <w:r>
-        <w:rPr>
-          <w:rFonts w:ascii="Calibri" w:hAnsi="Calibri" w:cs="Calibri"/>
-        </w:rPr>
         <w:lastRenderedPageBreak/>
         <w:t>Oskar on the method section, Fabian on the introduction and data sections, Valdemar on the model testing framework.</w:t>
       </w:r>
@@ -1645,11 +1640,6 @@
           <w:rFonts w:ascii="Calibri" w:hAnsi="Calibri" w:cs="Calibri"/>
         </w:rPr>
         <w:t xml:space="preserve">Use 10 pools of capital for concurrent trades to correctly calculate returns. Filter for high-conviction trades only to reduce the impact of brokerage fees on incorrect predictions. Modify the triple barrier to require higher expected profit per trade and a higher probability of success. Explore tuning the probability threshold and barrier height with Bayesian optimisation. Implement features that control </w:t>
-      </w:r>
-      <w:r>
-        <w:rPr>
-          <w:rFonts w:ascii="Calibri" w:hAnsi="Calibri" w:cs="Calibri"/>
-        </w:rPr>
         <w:lastRenderedPageBreak/>
         <w:t>the barrier height beyond just volatility. Test required_buy_probability and required_sell_probability thresholds to prevent overtrading. Explore defining thresholds as a percentage of total buy/sell orders instead of fixed probabilities. Investigate how to incorporate risk/reward into the model rather than relying solely on probability of correctness.</w:t>
       </w:r>
@@ -1991,7 +1981,7 @@
           <w:rFonts w:ascii="Calibri" w:hAnsi="Calibri" w:cs="Calibri"/>
         </w:rPr>
         <w:lastRenderedPageBreak/>
-        <w:t>Presented current model results and status of the midway report. Tue was very satisfied with the results so far. Tue could not assist much with the formalia in the report. Discussed next steps and areas to validate.</w:t>
+        <w:t>Presented current model results and status of the midway report. Tue was very satisfied with the results so far. Tue could not assist much with the formalia in the report. Discussed next steps and areas to validate. Tue recommended implementing brokerage fees in the result calculation, using an ensemble or model council approach to decide whether to initiate a trade, and testing on different periods of historic data using Hugging Face data.</w:t>
       </w:r>
     </w:p>
     <w:p>
@@ -2024,13 +2014,90 @@
         <w:rPr>
           <w:rFonts w:ascii="Calibri" w:hAnsi="Calibri" w:cs="Calibri"/>
         </w:rPr>
-        <w:t>Double-check that training and test splits are not mixed up. Include slippage and brokerage fees in the trading system – present results both with and without brokerage fees. Probe some of the trades manually and verify the price action against Yahoo Finance. Look into building an adapter that can convert Tue’s historic data from Hugging Face into minute-level data compatible with our pipeline. Validate the model on various two-week historic splits of data to confirm it performs well beyond the current test</w:t>
-      </w:r>
-      <w:r>
-        <w:rPr>
-          <w:rFonts w:ascii="Calibri" w:hAnsi="Calibri" w:cs="Calibri"/>
-        </w:rPr>
-        <w:t xml:space="preserve"> period.</w:t>
+        <w:t>Double-check that training and test splits are not mixed up. Include slippage and brokerage fees in the trading system – present results both with and without brokerage fees. Probe some of the trades manually and verify the price action against Yahoo Finance. Look into building an adapter that can convert Tue’s historic data from Hugging Face into minute-level data compatible with our pipeline. Validate the model on various two-week historic splits of data to confirm it performs well beyond the current test period. Investigate using an ensemble or model council to decide whether to initiate each trade, rather than relying on a single model’s prediction.</w:t>
+      </w:r>
+    </w:p>
+    <w:p>
+      <w:pPr>
+        <w:rPr>
+          <w:rFonts w:ascii="Calibri" w:hAnsi="Calibri" w:cs="Calibri"/>
+          <w:b/>
+          <w:color w:val="C00000"/>
+        </w:rPr>
+      </w:pPr>
+      <w:r>
+        <w:rPr>
+          <w:rFonts w:ascii="Calibri" w:hAnsi="Calibri" w:cs="Calibri"/>
+          <w:b/>
+          <w:color w:val="C00000"/>
+        </w:rPr>
+        <w:t>Week 13: 24.03.26</w:t>
+      </w:r>
+    </w:p>
+    <w:p>
+      <w:pPr>
+        <w:rPr>
+          <w:rFonts w:ascii="Calibri" w:hAnsi="Calibri" w:cs="Calibri"/>
+          <w:b/>
+          <w:bCs/>
+          <w:i/>
+        </w:rPr>
+      </w:pPr>
+      <w:r>
+        <w:rPr>
+          <w:rFonts w:ascii="Calibri" w:hAnsi="Calibri" w:cs="Calibri"/>
+          <w:b/>
+          <w:bCs/>
+          <w:i/>
+          <w:iCs/>
+        </w:rPr>
+        <w:t>Presentation of results since last meeting</w:t>
+      </w:r>
+    </w:p>
+    <w:p>
+      <w:pPr>
+        <w:rPr>
+          <w:rFonts w:ascii="Calibri" w:hAnsi="Calibri" w:cs="Calibri"/>
+        </w:rPr>
+      </w:pPr>
+      <w:r>
+        <w:rPr>
+          <w:rFonts w:ascii="Calibri" w:hAnsi="Calibri" w:cs="Calibri"/>
+        </w:rPr>
+        <w:t>Presented current model results and discussed the stock selection heuristic, equity allocation strategy, and ethics considerations. Tue suggested updating the heuristic to trade based on past performance rather than solely selecting the 50 largest companies by market cap. Discussed Bayesian optimisation: Tue remains against using it for training but agreed it could be tested during the testing phase by switching thresholds without retraining the model. Explored equity partitioning strategies, including going all in on a single trade and initiating a new one only when it completes. Tue recommended using an ensemble method to cross-check probabilities across multiple models to increase conviction. Discussed data ethics, including reproducibility and whether the companies used for training are ethical. Also discussed broader ethical implications: whether the model works long term, the risk of users misreading returns as guaranteed, and whether training a model aimed at short-term trading is ethical in itself. Tue had no specific guidance on feature evaluation. Discussed getting the Hugging Face data working with the pipeline. Results should be inserted into the method section of the report.</w:t>
+      </w:r>
+    </w:p>
+    <w:p>
+      <w:pPr>
+        <w:rPr>
+          <w:rFonts w:ascii="Calibri" w:hAnsi="Calibri" w:cs="Calibri"/>
+          <w:b/>
+          <w:bCs/>
+          <w:i/>
+        </w:rPr>
+      </w:pPr>
+      <w:r>
+        <w:rPr>
+          <w:rFonts w:ascii="Calibri" w:hAnsi="Calibri" w:cs="Calibri"/>
+          <w:b/>
+          <w:bCs/>
+          <w:i/>
+          <w:iCs/>
+        </w:rPr>
+        <w:t>Action points for next week</w:t>
+      </w:r>
+    </w:p>
+    <w:p>
+      <w:pPr>
+        <w:rPr>
+          <w:rFonts w:ascii="Calibri" w:hAnsi="Calibri" w:cs="Calibri"/>
+        </w:rPr>
+      </w:pPr>
+      <w:r>
+        <w:rPr>
+          <w:rFonts w:ascii="Calibri" w:hAnsi="Calibri" w:cs="Calibri"/>
+        </w:rPr>
+        <w:t>Update the stock selection heuristic to trade based on past performance instead of solely using the 50 largest tech companies by market cap. Test different equity partitioning strategies, including allocating all capital to a single trade at a time and trying different splits. Implement the ensemble method to cross-check probabilities across multiple models and increase trade conviction. Get Tue’s historic data from Hugging Face working with the pipeline. Insert results into the method section of the report. Address data ethics in the report: reproducibility and ethical assessment of selected companies. Discuss the ethical implications of short-term trading models in the report, including the risk of users misinterpreting returns as guaranteed.</w:t>
       </w:r>
     </w:p>
     <w:p>

</xml_diff>